<commit_message>
Drop skeleton-reuse note from guides and add rule to spec
Co-Authored-By: Claude Opus 5.5 <noreply@anthropic.com>
Claude-Session: https://claude.ai/code/session_01BkUHvVtkxEBBCip6XRXoJu
</commit_message>
<xml_diff>
--- a/worldbook/台湾背景世界书by鲷鱼烧.docx
+++ b/worldbook/台湾背景世界书by鲷鱼烧.docx
@@ -152,11 +152,6 @@
     <w:p>
       <w:r>
         <w:t>本世界书的目的：让AI角色像真实生活在当代台湾社会里的人，会被时间、钱、地点、他人和身体状态影响，而不是悬浮在空中对话。内容来自网络搜索和与AI的讨论，可能有不准确的地方，按需取用。数据截至2026年10月。</w:t>
-      </w:r>
-    </w:p>
-    <w:p>
-      <w:r>
-        <w:t>本篇沿用「日本背景世界书」「韩国背景世界书」的骨架和写法：每条规则写成"当X时，写Y"，用动作、物件、台词和数字代替抽象形容词；不用全大写和"必须！"之类的强调；示例只示范方向。正文用简体字书写，但词汇保留台湾说法（机车、捷运、便当）。</w:t>
       </w:r>
     </w:p>
     <w:p/>

</xml_diff>

<commit_message>
Remove cross-book comparisons; each world book stands alone
Co-Authored-By: Claude Opus 5.5 <noreply@anthropic.com>
Claude-Session: https://claude.ai/code/session_01BkUHvVtkxEBBCip6XRXoJu
</commit_message>
<xml_diff>
--- a/worldbook/台湾背景世界书by鲷鱼烧.docx
+++ b/worldbook/台湾背景世界书by鲷鱼烧.docx
@@ -204,7 +204,7 @@
     </w:p>
     <w:p>
       <w:r>
-        <w:t>共通主题：</w:t>
+        <w:t>通用主题：</w:t>
       </w:r>
     </w:p>
     <w:p>
@@ -279,7 +279,7 @@
     </w:p>
     <w:p>
       <w:r>
-        <w:t>台湾特有主题：</w:t>
+        <w:t>台湾专题：</w:t>
       </w:r>
     </w:p>
     <w:p>
@@ -383,28 +383,17 @@
     <w:p/>
     <w:p>
       <w:r>
-        <w:t>【为什么这样分类】</w:t>
-      </w:r>
-    </w:p>
-    <w:p>
-      <w:r>
-        <w:t>台湾版保留了各国共通的主题，把塑造台湾人更深的几股力量单独成篇：认同与政治（含兵役）、语言与族群、职场与低薪、居住、宗教与民俗。机车和街头生活并进身体篇，升学并进家庭篇。附件改为"用语保真"，因为角色本来就说中文，需要防的是被写成大陆用语。</w:t>
-      </w:r>
-    </w:p>
-    <w:p/>
-    <w:p>
-      <w:r>
-        <w:t>【和日本、韩国版的主要区别】</w:t>
-      </w:r>
-    </w:p>
-    <w:p>
-      <w:r>
-        <w:t>- 说与不说：日本是建前本音、从缝里漏出来；韩国是先憋再爆；台湾是当面客气、背后发文（LINE小群、脆、Dcard）。</w:t>
-      </w:r>
-    </w:p>
-    <w:p>
-      <w:r>
-        <w:t>- 上下关系比日韩松，同事叫英文名或○○哥○○姐。</w:t>
+        <w:t>【写台湾角色时最重要的几点】</w:t>
+      </w:r>
+    </w:p>
+    <w:p>
+      <w:r>
+        <w:t>- 说与不说：当面客气、背后发文（LINE小群、脆、Dcard）。</w:t>
+      </w:r>
+    </w:p>
+    <w:p>
+      <w:r>
+        <w:t>- 上下关系相对松，同事叫英文名或○○哥○○姐；对长辈仍要礼貌。</w:t>
       </w:r>
     </w:p>
     <w:p>
@@ -414,7 +403,12 @@
     </w:p>
     <w:p>
       <w:r>
-        <w:t>- 独有的压力：低薪和高房价、两岸和选举、少子化。</w:t>
+        <w:t>- 用词要是台湾的说法（见附件），机车、捷运、便当，不写成大陆用语。</w:t>
+      </w:r>
+    </w:p>
+    <w:p>
+      <w:r>
+        <w:t>- 塑造台湾年轻人最深的压力：低薪和高房价、两岸和选举、少子化。</w:t>
       </w:r>
     </w:p>
     <w:p/>

</xml_diff>